<commit_message>
Feature engineering report modification
</commit_message>
<xml_diff>
--- a/Text/NEXORA CARE FLOW Exploratory Data Analysis (EDA).docx
+++ b/Text/NEXORA CARE FLOW Exploratory Data Analysis (EDA).docx
@@ -53,10 +53,211 @@
           <w:szCs w:val="36"/>
           <w:lang w:eastAsia="en-GB"/>
         </w:rPr>
-        <w:t xml:space="preserve">Appointment Records – </w:t>
+        <w:t>Appointment Records – Exploratory Data Analysis (EDA)</w:t>
+      </w:r>
+    </w:p>
+    <w:p>
+      <w:pPr>
+        <w:spacing w:before="100" w:beforeAutospacing="1" w:after="100" w:afterAutospacing="1" w:line="240" w:lineRule="auto"/>
+        <w:rPr>
+          <w:rFonts w:ascii="Times New Roman" w:eastAsia="Times New Roman" w:hAnsi="Times New Roman" w:cs="Times New Roman"/>
+          <w:sz w:val="24"/>
+          <w:szCs w:val="24"/>
+          <w:lang w:eastAsia="en-GB"/>
+        </w:rPr>
+      </w:pPr>
+      <w:r>
+        <w:rPr>
+          <w:rFonts w:ascii="Times New Roman" w:eastAsia="Times New Roman" w:hAnsi="Times New Roman" w:cs="Times New Roman"/>
+          <w:b/>
+          <w:bCs/>
+          <w:sz w:val="24"/>
+          <w:szCs w:val="24"/>
+          <w:lang w:eastAsia="en-GB"/>
+        </w:rPr>
+        <w:t>Prepared by:</w:t>
+      </w:r>
+      <w:r>
+        <w:rPr>
+          <w:rFonts w:ascii="Times New Roman" w:eastAsia="Times New Roman" w:hAnsi="Times New Roman" w:cs="Times New Roman"/>
+          <w:sz w:val="24"/>
+          <w:szCs w:val="24"/>
+          <w:lang w:eastAsia="en-GB"/>
+        </w:rPr>
+        <w:t xml:space="preserve"> Paul</w:t>
+      </w:r>
+      <w:r>
+        <w:rPr>
+          <w:rFonts w:ascii="Times New Roman" w:eastAsia="Times New Roman" w:hAnsi="Times New Roman" w:cs="Times New Roman"/>
+          <w:sz w:val="24"/>
+          <w:szCs w:val="24"/>
+          <w:lang w:eastAsia="en-GB"/>
+        </w:rPr>
+        <w:t xml:space="preserve"> </w:t>
+      </w:r>
+      <w:proofErr w:type="spellStart"/>
+      <w:r>
+        <w:rPr>
+          <w:rFonts w:ascii="Times New Roman" w:eastAsia="Times New Roman" w:hAnsi="Times New Roman" w:cs="Times New Roman"/>
+          <w:sz w:val="24"/>
+          <w:szCs w:val="24"/>
+          <w:lang w:eastAsia="en-GB"/>
+        </w:rPr>
+        <w:t>Anyira</w:t>
+      </w:r>
+      <w:proofErr w:type="spellEnd"/>
+      <w:r>
+        <w:rPr>
+          <w:rFonts w:ascii="Times New Roman" w:eastAsia="Times New Roman" w:hAnsi="Times New Roman" w:cs="Times New Roman"/>
+          <w:sz w:val="24"/>
+          <w:szCs w:val="24"/>
+          <w:lang w:eastAsia="en-GB"/>
+        </w:rPr>
+        <w:br/>
+      </w:r>
+      <w:r>
+        <w:rPr>
+          <w:rFonts w:ascii="Times New Roman" w:eastAsia="Times New Roman" w:hAnsi="Times New Roman" w:cs="Times New Roman"/>
+          <w:b/>
+          <w:bCs/>
+          <w:sz w:val="24"/>
+          <w:szCs w:val="24"/>
+          <w:lang w:eastAsia="en-GB"/>
+        </w:rPr>
+        <w:t>Role:</w:t>
+      </w:r>
+      <w:r>
+        <w:rPr>
+          <w:rFonts w:ascii="Times New Roman" w:eastAsia="Times New Roman" w:hAnsi="Times New Roman" w:cs="Times New Roman"/>
+          <w:sz w:val="24"/>
+          <w:szCs w:val="24"/>
+          <w:lang w:eastAsia="en-GB"/>
+        </w:rPr>
+        <w:t xml:space="preserve"> Data Scientist Consultant</w:t>
+      </w:r>
+      <w:r>
+        <w:rPr>
+          <w:rFonts w:ascii="Times New Roman" w:eastAsia="Times New Roman" w:hAnsi="Times New Roman" w:cs="Times New Roman"/>
+          <w:sz w:val="24"/>
+          <w:szCs w:val="24"/>
+          <w:lang w:eastAsia="en-GB"/>
+        </w:rPr>
+        <w:br/>
+      </w:r>
+      <w:r>
+        <w:rPr>
+          <w:rFonts w:ascii="Times New Roman" w:eastAsia="Times New Roman" w:hAnsi="Times New Roman" w:cs="Times New Roman"/>
+          <w:b/>
+          <w:bCs/>
+          <w:sz w:val="24"/>
+          <w:szCs w:val="24"/>
+          <w:lang w:eastAsia="en-GB"/>
+        </w:rPr>
+        <w:t>Organisation:</w:t>
+      </w:r>
+      <w:r>
+        <w:rPr>
+          <w:rFonts w:ascii="Times New Roman" w:eastAsia="Times New Roman" w:hAnsi="Times New Roman" w:cs="Times New Roman"/>
+          <w:sz w:val="24"/>
+          <w:szCs w:val="24"/>
+          <w:lang w:eastAsia="en-GB"/>
+        </w:rPr>
+        <w:t xml:space="preserve"> AMDARI</w:t>
+      </w:r>
+      <w:r>
+        <w:rPr>
+          <w:rFonts w:ascii="Times New Roman" w:eastAsia="Times New Roman" w:hAnsi="Times New Roman" w:cs="Times New Roman"/>
+          <w:sz w:val="24"/>
+          <w:szCs w:val="24"/>
+          <w:lang w:eastAsia="en-GB"/>
+        </w:rPr>
+        <w:br/>
+      </w:r>
+      <w:r>
+        <w:rPr>
+          <w:rFonts w:ascii="Times New Roman" w:eastAsia="Times New Roman" w:hAnsi="Times New Roman" w:cs="Times New Roman"/>
+          <w:b/>
+          <w:bCs/>
+          <w:sz w:val="24"/>
+          <w:szCs w:val="24"/>
+          <w:lang w:eastAsia="en-GB"/>
+        </w:rPr>
+        <w:t>Project:</w:t>
+      </w:r>
+      <w:r>
+        <w:rPr>
+          <w:rFonts w:ascii="Times New Roman" w:eastAsia="Times New Roman" w:hAnsi="Times New Roman" w:cs="Times New Roman"/>
+          <w:sz w:val="24"/>
+          <w:szCs w:val="24"/>
+          <w:lang w:eastAsia="en-GB"/>
+        </w:rPr>
+        <w:t xml:space="preserve"> </w:t>
+      </w:r>
+      <w:proofErr w:type="spellStart"/>
+      <w:r>
+        <w:rPr>
+          <w:rFonts w:ascii="Times New Roman" w:eastAsia="Times New Roman" w:hAnsi="Times New Roman" w:cs="Times New Roman"/>
+          <w:sz w:val="24"/>
+          <w:szCs w:val="24"/>
+          <w:lang w:eastAsia="en-GB"/>
+        </w:rPr>
+        <w:t>Nexora</w:t>
+      </w:r>
+      <w:proofErr w:type="spellEnd"/>
+      <w:r>
+        <w:rPr>
+          <w:rFonts w:ascii="Times New Roman" w:eastAsia="Times New Roman" w:hAnsi="Times New Roman" w:cs="Times New Roman"/>
+          <w:sz w:val="24"/>
+          <w:szCs w:val="24"/>
+          <w:lang w:eastAsia="en-GB"/>
+        </w:rPr>
+        <w:t xml:space="preserve"> Care Flow – Appointment Forecasting</w:t>
+      </w:r>
+      <w:r>
+        <w:rPr>
+          <w:rFonts w:ascii="Times New Roman" w:eastAsia="Times New Roman" w:hAnsi="Times New Roman" w:cs="Times New Roman"/>
+          <w:sz w:val="24"/>
+          <w:szCs w:val="24"/>
+          <w:lang w:eastAsia="en-GB"/>
+        </w:rPr>
+        <w:br/>
+      </w:r>
+      <w:r>
+        <w:rPr>
+          <w:rFonts w:ascii="Times New Roman" w:eastAsia="Times New Roman" w:hAnsi="Times New Roman" w:cs="Times New Roman"/>
+          <w:b/>
+          <w:bCs/>
+          <w:sz w:val="24"/>
+          <w:szCs w:val="24"/>
+          <w:lang w:eastAsia="en-GB"/>
+        </w:rPr>
+        <w:t>Date:</w:t>
+      </w:r>
+      <w:r>
+        <w:rPr>
+          <w:rFonts w:ascii="Times New Roman" w:eastAsia="Times New Roman" w:hAnsi="Times New Roman" w:cs="Times New Roman"/>
+          <w:sz w:val="24"/>
+          <w:szCs w:val="24"/>
+          <w:lang w:eastAsia="en-GB"/>
+        </w:rPr>
+        <w:t xml:space="preserve"> 30</w:t>
       </w:r>
       <w:bookmarkStart w:id="0" w:name="_GoBack"/>
-      <w:r>
+      <w:bookmarkEnd w:id="0"/>
+      <w:r>
+        <w:rPr>
+          <w:rFonts w:ascii="Times New Roman" w:eastAsia="Times New Roman" w:hAnsi="Times New Roman" w:cs="Times New Roman"/>
+          <w:sz w:val="24"/>
+          <w:szCs w:val="24"/>
+          <w:lang w:eastAsia="en-GB"/>
+        </w:rPr>
+        <w:t xml:space="preserve"> August 2026</w:t>
+      </w:r>
+    </w:p>
+    <w:p>
+      <w:pPr>
+        <w:spacing w:before="100" w:beforeAutospacing="1" w:after="100" w:afterAutospacing="1" w:line="240" w:lineRule="auto"/>
+        <w:outlineLvl w:val="1"/>
         <w:rPr>
           <w:rFonts w:ascii="Times New Roman" w:eastAsia="Times New Roman" w:hAnsi="Times New Roman" w:cs="Times New Roman"/>
           <w:b/>
@@ -65,10 +266,8 @@
           <w:szCs w:val="36"/>
           <w:lang w:eastAsia="en-GB"/>
         </w:rPr>
-        <w:t>Exploratory Data Analysis (EDA)</w:t>
-      </w:r>
-    </w:p>
-    <w:bookmarkEnd w:id="0"/>
+      </w:pPr>
+    </w:p>
     <w:p>
       <w:pPr>
         <w:spacing w:before="100" w:beforeAutospacing="1" w:after="100" w:afterAutospacing="1" w:line="240" w:lineRule="auto"/>
@@ -522,6 +721,7 @@
           <w:szCs w:val="24"/>
           <w:lang w:eastAsia="en-GB"/>
         </w:rPr>
+        <w:lastRenderedPageBreak/>
         <w:t>This analysis investigates whether appointment demand follows a recurring weekly pattern. The clinic-level cross-tabulation further examines whether individual clinics have different busiest days.</w:t>
       </w:r>
     </w:p>
@@ -565,7 +765,6 @@
           <w:szCs w:val="27"/>
           <w:lang w:eastAsia="en-GB"/>
         </w:rPr>
-        <w:lastRenderedPageBreak/>
         <w:t>5. Seasonal Analysis</w:t>
       </w:r>
     </w:p>
@@ -1150,6 +1349,7 @@
           <w:szCs w:val="24"/>
           <w:lang w:eastAsia="en-GB"/>
         </w:rPr>
+        <w:lastRenderedPageBreak/>
         <w:t>Analysing booking channels provides insight into how patients access appointments and whether particular channels account for a substantial proportion of demand. This information can also help identify variables that may be useful when developing forecasting features.</w:t>
       </w:r>
     </w:p>
@@ -1234,7 +1434,6 @@
           <w:szCs w:val="24"/>
           <w:lang w:eastAsia="en-GB"/>
         </w:rPr>
-        <w:lastRenderedPageBreak/>
         <w:t xml:space="preserve">Booking lead time provides information about </w:t>
       </w:r>
       <w:r>

</xml_diff>